<commit_message>
Tema 1-3 taslaklari: 1.6-1.8, Tema 2 ve Tema 3 kazanimlari
- Kim11.1.6-1.8 (tepkime hizi, hiza etki eden faktorler, hiz denklemi)
- Kim11.2.1-2.14 (denge, asit-baz dengesi, cozunurluk dengesi)
- Kim11.3.1-3.3 (yesil hidrojen, nanoteknoloji, mikroplastikler)
- Bolum sonu ve unite sonu sorulari (cevaplar kirmizi)
- Tema 1-3 cevap anahtarlari, dijital icerik taslaklari, icindekiler
- Formlar: TEMA-1/2/3 olcme-degerlendirme formlari, kalip, olcme,
  farklilastirma, kopru kurma ve on degerlendirme tablolari
</commit_message>
<xml_diff>
--- a/Formlar/Kopru_Kurma_kimya11.docx
+++ b/Formlar/Kopru_Kurma_kimya11.docx
@@ -338,16 +338,9 @@
                 <w:rFonts w:ascii="Times New Roman" w:hAnsi="Times New Roman" w:cs="Times New Roman"/>
                 <w:lang w:val="tr-TR"/>
               </w:rPr>
-              <w:t>Köpru</w:t>
+              <w:t>Köprü Kurma</w:t>
             </w:r>
             <w:proofErr w:type="spellEnd"/>
-            <w:r>
-              <w:rPr>
-                <w:rFonts w:ascii="Times New Roman" w:hAnsi="Times New Roman" w:cs="Times New Roman"/>
-                <w:lang w:val="tr-TR"/>
-              </w:rPr>
-              <w:t>̈ Kurma</w:t>
-            </w:r>
           </w:p>
         </w:tc>
         <w:tc>
@@ -362,6 +355,12 @@
                 <w:lang w:val="tr-TR"/>
               </w:rPr>
             </w:pPr>
+            <w:r>
+              <w:rPr>
+                <w:rFonts w:ascii="Times New Roman" w:hAnsi="Times New Roman"/>
+              </w:rPr>
+              <w:t>Atmosferdeki karbon dioksit miktarının artması ile okyanus sularının asitlik düzeyi arasındaki ilişki sorularak bu durumun kabuklu canlılar üzerindeki etkisi örnek verilebilir.</w:t>
+            </w:r>
           </w:p>
         </w:tc>
         <w:tc>
@@ -377,6 +376,12 @@
                 <w:lang w:val="tr-TR"/>
               </w:rPr>
             </w:pPr>
+            <w:r>
+              <w:rPr>
+                <w:rFonts w:ascii="Times New Roman" w:hAnsi="Times New Roman"/>
+              </w:rPr>
+              <w:t>Kim11.2.1 dosyasında Tema 2 girişinde Köprü Kurma Atölyesi olarak yapıldı.</w:t>
+            </w:r>
           </w:p>
         </w:tc>
       </w:tr>
@@ -384,7 +389,7 @@
         <w:tc>
           <w:tcPr>
             <w:tcW w:w="1081" w:type="dxa"/>
-            <w:shd w:val="clear" w:color="auto" w:fill="00B0F0"/>
+            <w:shd w:val="clear" w:color="auto" w:fill="92D050"/>
           </w:tcPr>
           <w:p>
             <w:pPr>
@@ -421,16 +426,9 @@
                 <w:rFonts w:ascii="Times New Roman" w:hAnsi="Times New Roman" w:cs="Times New Roman"/>
                 <w:lang w:val="tr-TR"/>
               </w:rPr>
-              <w:t>Köpru</w:t>
+              <w:t>Köprü Kurma</w:t>
             </w:r>
             <w:proofErr w:type="spellEnd"/>
-            <w:r>
-              <w:rPr>
-                <w:rFonts w:ascii="Times New Roman" w:hAnsi="Times New Roman" w:cs="Times New Roman"/>
-                <w:lang w:val="tr-TR"/>
-              </w:rPr>
-              <w:t>̈ Kurma</w:t>
-            </w:r>
           </w:p>
         </w:tc>
         <w:tc>
@@ -445,11 +443,18 @@
                 <w:lang w:val="tr-TR"/>
               </w:rPr>
             </w:pPr>
+            <w:r>
+              <w:rPr>
+                <w:rFonts w:ascii="Times New Roman" w:hAnsi="Times New Roman"/>
+              </w:rPr>
+              <w:t>Evsel atıkların değerlendirilmesi, çöplerin sürdürülebilir bir şekilde yönetilmesi ve kaynakların daha etkin bir şekilde kullanılabilmesi için neler yapılabileceği ve evsel atıkların hangi alanlarda değerlendirilebileceği gibi konularda tartışma ortamı oluşturulabilir. ... Öğrencilerden evsel atıklardan enerji üretiminin çevresel etkilerinin neler olabileceğine ilişkin fikir yürütmeleri istenebilir.</w:t>
+            </w:r>
           </w:p>
         </w:tc>
         <w:tc>
           <w:tcPr>
             <w:tcW w:w="1457" w:type="dxa"/>
+            <w:shd w:val="clear" w:color="auto" w:fill="E97132" w:themeFill="accent2"/>
           </w:tcPr>
           <w:p>
             <w:pPr>
@@ -459,6 +464,12 @@
                 <w:lang w:val="tr-TR"/>
               </w:rPr>
             </w:pPr>
+            <w:r>
+              <w:rPr>
+                <w:rFonts w:ascii="Times New Roman" w:hAnsi="Times New Roman"/>
+              </w:rPr>
+              <w:t>Kim11.3.1 dosyasında Tema 3 girişinde Köprü Kurma Atölyesi olarak yapıldı.</w:t>
+            </w:r>
           </w:p>
         </w:tc>
       </w:tr>

</xml_diff>